<commit_message>
Fagerström notunda tabloyu hocanın orijinal slayt görseliyle değiştir
Co-Authored-By: Claude Opus 5.5 <noreply@anthropic.com>
Claude-Session: https://claude.ai/code/session_013LLNDYinKcb3EYpgyk92AX
</commit_message>
<xml_diff>
--- a/Sunumlar/Fagerstrom_Testi_Notu.docx
+++ b/Sunumlar/Fagerstrom_Testi_Notu.docx
@@ -159,387 +159,59 @@
         <w:t>2. Testin soruları ve puanlaması (Hoca, Slayt 51)</w:t>
       </w:r>
     </w:p>
-    <w:tbl>
-      <w:tblPr>
-        <w:tblW w:type="auto" w:w="0"/>
-        <w:tblLook w:firstColumn="1" w:firstRow="1" w:lastColumn="0" w:lastRow="0" w:noHBand="0" w:noVBand="1" w:val="04A0"/>
+    <w:p>
+      <w:pPr>
+        <w:spacing w:after="40"/>
         <w:jc w:val="center"/>
-        <w:tblBorders>
-          <w:top w:val="single" w:sz="4" w:color="C9DCDF"/>
-          <w:left w:val="single" w:sz="4" w:color="C9DCDF"/>
-          <w:bottom w:val="single" w:sz="4" w:color="C9DCDF"/>
-          <w:right w:val="single" w:sz="4" w:color="C9DCDF"/>
-          <w:insideH w:val="single" w:sz="4" w:color="C9DCDF"/>
-          <w:insideV w:val="single" w:sz="4" w:color="C9DCDF"/>
-        </w:tblBorders>
-      </w:tblPr>
-      <w:tblGrid>
-        <w:gridCol w:w="3102"/>
-        <w:gridCol w:w="3102"/>
-        <w:gridCol w:w="3102"/>
-      </w:tblGrid>
-      <w:tr>
-        <w:tc>
-          <w:tcPr>
-            <w:tcW w:type="dxa" w:w="5102"/>
-            <w:shd w:val="clear" w:color="auto" w:fill="0F4C5C"/>
-          </w:tcPr>
-          <w:p>
-            <w:r/>
-            <w:r>
-              <w:rPr>
-                <w:b/>
-                <w:color w:val="FFFFFF"/>
-                <w:sz w:val="20"/>
-              </w:rPr>
-              <w:t>Soru</w:t>
-            </w:r>
-          </w:p>
-        </w:tc>
-        <w:tc>
-          <w:tcPr>
-            <w:tcW w:type="dxa" w:w="2551"/>
-            <w:shd w:val="clear" w:color="auto" w:fill="0F4C5C"/>
-          </w:tcPr>
-          <w:p>
-            <w:r/>
-            <w:r>
-              <w:rPr>
-                <w:b/>
-                <w:color w:val="FFFFFF"/>
-                <w:sz w:val="20"/>
-              </w:rPr>
-              <w:t>Cevap</w:t>
-            </w:r>
-          </w:p>
-        </w:tc>
-        <w:tc>
-          <w:tcPr>
-            <w:tcW w:type="dxa" w:w="1134"/>
-            <w:shd w:val="clear" w:color="auto" w:fill="0F4C5C"/>
-          </w:tcPr>
-          <w:p>
-            <w:r/>
-            <w:r>
-              <w:rPr>
-                <w:b/>
-                <w:color w:val="FFFFFF"/>
-                <w:sz w:val="20"/>
-              </w:rPr>
-              <w:t>Puan</w:t>
-            </w:r>
-          </w:p>
-        </w:tc>
-      </w:tr>
-      <w:tr>
-        <w:tc>
-          <w:tcPr>
-            <w:tcW w:type="dxa" w:w="5102"/>
-          </w:tcPr>
-          <w:p>
-            <w:r/>
-            <w:r>
-              <w:rPr>
-                <w:sz w:val="20"/>
-              </w:rPr>
-              <w:t>1. Her gün genellikle kaç sigara içiyorsunuz?</w:t>
-            </w:r>
-          </w:p>
-        </w:tc>
-        <w:tc>
-          <w:tcPr>
-            <w:tcW w:type="dxa" w:w="2551"/>
-          </w:tcPr>
-          <w:p>
-            <w:r/>
-            <w:r>
-              <w:rPr>
-                <w:sz w:val="20"/>
-              </w:rPr>
-              <w:t>0–10</w:t>
-              <w:br/>
-              <w:t>11–20</w:t>
-              <w:br/>
-              <w:t>21–30</w:t>
-              <w:br/>
-              <w:t>30'dan fazla</w:t>
-            </w:r>
-          </w:p>
-        </w:tc>
-        <w:tc>
-          <w:tcPr>
-            <w:tcW w:type="dxa" w:w="1134"/>
-          </w:tcPr>
-          <w:p>
-            <w:r/>
-            <w:r>
-              <w:rPr>
-                <w:sz w:val="20"/>
-              </w:rPr>
-              <w:t>0</w:t>
-              <w:br/>
-              <w:t>1</w:t>
-              <w:br/>
-              <w:t>2</w:t>
-              <w:br/>
-              <w:t>3</w:t>
-            </w:r>
-          </w:p>
-        </w:tc>
-      </w:tr>
-      <w:tr>
-        <w:tc>
-          <w:tcPr>
-            <w:tcW w:type="dxa" w:w="5102"/>
-          </w:tcPr>
-          <w:p>
-            <w:r/>
-            <w:r>
-              <w:rPr>
-                <w:sz w:val="20"/>
-              </w:rPr>
-              <w:t>2. İlk sigaranızı uyandıktan ne kadar sonra içiyorsunuz?</w:t>
-            </w:r>
-          </w:p>
-        </w:tc>
-        <w:tc>
-          <w:tcPr>
-            <w:tcW w:type="dxa" w:w="2551"/>
-          </w:tcPr>
-          <w:p>
-            <w:r/>
-            <w:r>
-              <w:rPr>
-                <w:sz w:val="20"/>
-              </w:rPr>
-              <w:t>0–5 dk</w:t>
-              <w:br/>
-              <w:t>6–30 dk</w:t>
-              <w:br/>
-              <w:t>31–60 dk</w:t>
-              <w:br/>
-              <w:t>60 dk'dan sonra</w:t>
-            </w:r>
-          </w:p>
-        </w:tc>
-        <w:tc>
-          <w:tcPr>
-            <w:tcW w:type="dxa" w:w="1134"/>
-          </w:tcPr>
-          <w:p>
-            <w:r/>
-            <w:r>
-              <w:rPr>
-                <w:sz w:val="20"/>
-              </w:rPr>
-              <w:t>3</w:t>
-              <w:br/>
-              <w:t>2</w:t>
-              <w:br/>
-              <w:t>1</w:t>
-              <w:br/>
-              <w:t>0</w:t>
-            </w:r>
-          </w:p>
-        </w:tc>
-      </w:tr>
-      <w:tr>
-        <w:tc>
-          <w:tcPr>
-            <w:tcW w:type="dxa" w:w="5102"/>
-          </w:tcPr>
-          <w:p>
-            <w:r/>
-            <w:r>
-              <w:rPr>
-                <w:sz w:val="20"/>
-              </w:rPr>
-              <w:t>3. Sigara içilmeyen yerlerde sigara içmemekte zorlanıyor musunuz?</w:t>
-            </w:r>
-          </w:p>
-        </w:tc>
-        <w:tc>
-          <w:tcPr>
-            <w:tcW w:type="dxa" w:w="2551"/>
-          </w:tcPr>
-          <w:p>
-            <w:r/>
-            <w:r>
-              <w:rPr>
-                <w:sz w:val="20"/>
-              </w:rPr>
-              <w:t>Hayır</w:t>
-              <w:br/>
-              <w:t>Evet</w:t>
-            </w:r>
-          </w:p>
-        </w:tc>
-        <w:tc>
-          <w:tcPr>
-            <w:tcW w:type="dxa" w:w="1134"/>
-          </w:tcPr>
-          <w:p>
-            <w:r/>
-            <w:r>
-              <w:rPr>
-                <w:sz w:val="20"/>
-              </w:rPr>
-              <w:t>0</w:t>
-              <w:br/>
-              <w:t>1</w:t>
-            </w:r>
-          </w:p>
-        </w:tc>
-      </w:tr>
-      <w:tr>
-        <w:tc>
-          <w:tcPr>
-            <w:tcW w:type="dxa" w:w="5102"/>
-          </w:tcPr>
-          <w:p>
-            <w:r/>
-            <w:r>
-              <w:rPr>
-                <w:sz w:val="20"/>
-              </w:rPr>
-              <w:t>4. Hangi sigaradan vazgeçmekte en çok zorlanırsınız?</w:t>
-            </w:r>
-          </w:p>
-        </w:tc>
-        <w:tc>
-          <w:tcPr>
-            <w:tcW w:type="dxa" w:w="2551"/>
-          </w:tcPr>
-          <w:p>
-            <w:r/>
-            <w:r>
-              <w:rPr>
-                <w:sz w:val="20"/>
-              </w:rPr>
-              <w:t>Sabah ilk içilen</w:t>
-              <w:br/>
-              <w:t>Diğer</w:t>
-            </w:r>
-          </w:p>
-        </w:tc>
-        <w:tc>
-          <w:tcPr>
-            <w:tcW w:type="dxa" w:w="1134"/>
-          </w:tcPr>
-          <w:p>
-            <w:r/>
-            <w:r>
-              <w:rPr>
-                <w:sz w:val="20"/>
-              </w:rPr>
-              <w:t>1</w:t>
-              <w:br/>
-              <w:t>0</w:t>
-            </w:r>
-          </w:p>
-        </w:tc>
-      </w:tr>
-      <w:tr>
-        <w:tc>
-          <w:tcPr>
-            <w:tcW w:type="dxa" w:w="5102"/>
-          </w:tcPr>
-          <w:p>
-            <w:r/>
-            <w:r>
-              <w:rPr>
-                <w:sz w:val="20"/>
-              </w:rPr>
-              <w:t>5. Günün ilk saatlerinde sonraki saatlere göre daha sık sigara içiyor musunuz?</w:t>
-            </w:r>
-          </w:p>
-        </w:tc>
-        <w:tc>
-          <w:tcPr>
-            <w:tcW w:type="dxa" w:w="2551"/>
-          </w:tcPr>
-          <w:p>
-            <w:r/>
-            <w:r>
-              <w:rPr>
-                <w:sz w:val="20"/>
-              </w:rPr>
-              <w:t>Hayır</w:t>
-              <w:br/>
-              <w:t>Evet</w:t>
-            </w:r>
-          </w:p>
-        </w:tc>
-        <w:tc>
-          <w:tcPr>
-            <w:tcW w:type="dxa" w:w="1134"/>
-          </w:tcPr>
-          <w:p>
-            <w:r/>
-            <w:r>
-              <w:rPr>
-                <w:sz w:val="20"/>
-              </w:rPr>
-              <w:t>0</w:t>
-              <w:br/>
-              <w:t>1</w:t>
-            </w:r>
-          </w:p>
-        </w:tc>
-      </w:tr>
-      <w:tr>
-        <w:tc>
-          <w:tcPr>
-            <w:tcW w:type="dxa" w:w="5102"/>
-          </w:tcPr>
-          <w:p>
-            <w:r/>
-            <w:r>
-              <w:rPr>
-                <w:sz w:val="20"/>
-              </w:rPr>
-              <w:t>6. Çok hasta olduğunuzda veya günün çoğunu yatakta geçirdiğinizde sigara içer misiniz?</w:t>
-            </w:r>
-          </w:p>
-        </w:tc>
-        <w:tc>
-          <w:tcPr>
-            <w:tcW w:type="dxa" w:w="2551"/>
-          </w:tcPr>
-          <w:p>
-            <w:r/>
-            <w:r>
-              <w:rPr>
-                <w:sz w:val="20"/>
-              </w:rPr>
-              <w:t>Hayır</w:t>
-              <w:br/>
-              <w:t>Evet</w:t>
-            </w:r>
-          </w:p>
-        </w:tc>
-        <w:tc>
-          <w:tcPr>
-            <w:tcW w:type="dxa" w:w="1134"/>
-          </w:tcPr>
-          <w:p>
-            <w:r/>
-            <w:r>
-              <w:rPr>
-                <w:sz w:val="20"/>
-              </w:rPr>
-              <w:t>0</w:t>
-              <w:br/>
-              <w:t>1</w:t>
-            </w:r>
-          </w:p>
-        </w:tc>
-      </w:tr>
-    </w:tbl>
-    <w:p>
-      <w:pPr>
-        <w:spacing w:after="80"/>
-      </w:pPr>
+      </w:pPr>
+      <w:r>
+        <w:drawing>
+          <wp:inline xmlns:a="http://schemas.openxmlformats.org/drawingml/2006/main" xmlns:pic="http://schemas.openxmlformats.org/drawingml/2006/picture">
+            <wp:extent cx="5580000" cy="3239521"/>
+            <wp:docPr id="1" name="Picture 1"/>
+            <wp:cNvGraphicFramePr>
+              <a:graphicFrameLocks noChangeAspect="1"/>
+            </wp:cNvGraphicFramePr>
+            <a:graphic>
+              <a:graphicData uri="http://schemas.openxmlformats.org/drawingml/2006/picture">
+                <pic:pic>
+                  <pic:nvPicPr>
+                    <pic:cNvPr id="0" name="fnbt_slayt51.png"/>
+                    <pic:cNvPicPr/>
+                  </pic:nvPicPr>
+                  <pic:blipFill>
+                    <a:blip r:embed="rId10"/>
+                    <a:stretch>
+                      <a:fillRect/>
+                    </a:stretch>
+                  </pic:blipFill>
+                  <pic:spPr>
+                    <a:xfrm>
+                      <a:off x="0" y="0"/>
+                      <a:ext cx="5580000" cy="3239521"/>
+                    </a:xfrm>
+                    <a:prstGeom prst="rect"/>
+                  </pic:spPr>
+                </pic:pic>
+              </a:graphicData>
+            </a:graphic>
+          </wp:inline>
+        </w:drawing>
+      </w:r>
+    </w:p>
+    <w:p>
+      <w:pPr>
+        <w:spacing w:after="160"/>
+        <w:jc w:val="center"/>
+      </w:pPr>
+      <w:r>
+        <w:rPr>
+          <w:i/>
+          <w:color w:val="5F7178"/>
+          <w:sz w:val="18"/>
+        </w:rPr>
+        <w:t>Görsel: Hocanın ders slaytı, Slayt 51 (orijinal tablo)</w:t>
+      </w:r>
     </w:p>
     <w:p>
       <w:pPr>

</xml_diff>